<commit_message>
docs: correct three stale claims in the summary and onboarding guide
- 09 F1.4 marked 个人信息维护 as unimplemented, but GET/PUT /api/user/profile,
  POST /api/user/avatar, Profile.vue and V3__user_profile.sql all exist. It is
  implemented; only password change is missing, so F1.3/F1.4 are now split out
  as 服务端注销 and 修改密码
- 09 also claimed 8 Controllers / 9 Services; actual is 14 / 16 (13 mappers,
  13 tables). The 全量读行为表 risk is struck from the open list because the
  matrix cache resolved it
- 10 said 89->90 Java files and 10 stages. Actual is 139 main + 19 test files.
  Added a table mapping the 9 incremental migrations to their features so a
  reader can understand where the extra files come from, plus a tag guide
  (skeleton-v1 baseline / template-v1 baseline-complete / template-v2 current)

template-v2 now points at HEAD with an annotated message.
</commit_message>
<xml_diff>
--- a/docs/word/09-项目总结报告.docx
+++ b/docs/word/09-项目总结报告.docx
@@ -464,7 +464,7 @@
             </w:r>
             <w:r>
               <w:rPr/>
-              <w:t xml:space="preserve">8 </w:t>
+              <w:t xml:space="preserve">14 </w:t>
             </w:r>
             <w:r>
               <w:rPr/>
@@ -480,7 +480,7 @@
             </w:r>
             <w:r>
               <w:rPr/>
-              <w:t xml:space="preserve">9 </w:t>
+              <w:t xml:space="preserve">16 </w:t>
             </w:r>
             <w:r>
               <w:rPr/>
@@ -493,6 +493,30 @@
             <w:r>
               <w:rPr/>
               <w:t>、</w:t>
+            </w:r>
+            <w:r>
+              <w:rPr/>
+              <w:t xml:space="preserve">13 </w:t>
+            </w:r>
+            <w:r>
+              <w:rPr/>
+              <w:t xml:space="preserve">个 </w:t>
+            </w:r>
+            <w:r>
+              <w:rPr/>
+              <w:t>Mapper</w:t>
+            </w:r>
+            <w:r>
+              <w:rPr/>
+              <w:t>、</w:t>
+            </w:r>
+            <w:r>
+              <w:rPr/>
+              <w:t xml:space="preserve">13 </w:t>
+            </w:r>
+            <w:r>
+              <w:rPr/>
+              <w:t>张表、</w:t>
             </w:r>
             <w:r>
               <w:rPr/>
@@ -1579,16 +1603,16 @@
         </w:tblCellMar>
       </w:tblPr>
       <w:tblGrid>
-        <w:gridCol w:w="972"/>
-        <w:gridCol w:w="4406"/>
-        <w:gridCol w:w="692"/>
-        <w:gridCol w:w="5269"/>
+        <w:gridCol w:w="841"/>
+        <w:gridCol w:w="3178"/>
+        <w:gridCol w:w="624"/>
+        <w:gridCol w:w="6696"/>
       </w:tblGrid>
       <w:tr>
         <w:trPr/>
         <w:tc>
           <w:tcPr>
-            <w:tcW w:w="972" w:type="dxa"/>
+            <w:tcW w:w="841" w:type="dxa"/>
             <w:tcBorders/>
             <w:vAlign w:val="center"/>
           </w:tcPr>
@@ -1610,7 +1634,7 @@
         </w:tc>
         <w:tc>
           <w:tcPr>
-            <w:tcW w:w="4406" w:type="dxa"/>
+            <w:tcW w:w="3178" w:type="dxa"/>
             <w:tcBorders/>
             <w:vAlign w:val="center"/>
           </w:tcPr>
@@ -1632,7 +1656,7 @@
         </w:tc>
         <w:tc>
           <w:tcPr>
-            <w:tcW w:w="692" w:type="dxa"/>
+            <w:tcW w:w="624" w:type="dxa"/>
             <w:tcBorders/>
             <w:vAlign w:val="center"/>
           </w:tcPr>
@@ -1654,7 +1678,7 @@
         </w:tc>
         <w:tc>
           <w:tcPr>
-            <w:tcW w:w="5269" w:type="dxa"/>
+            <w:tcW w:w="6696" w:type="dxa"/>
             <w:tcBorders/>
             <w:vAlign w:val="center"/>
           </w:tcPr>
@@ -1679,7 +1703,7 @@
         <w:trPr/>
         <w:tc>
           <w:tcPr>
-            <w:tcW w:w="972" w:type="dxa"/>
+            <w:tcW w:w="841" w:type="dxa"/>
             <w:tcBorders/>
             <w:vAlign w:val="center"/>
           </w:tcPr>
@@ -1699,7 +1723,7 @@
         </w:tc>
         <w:tc>
           <w:tcPr>
-            <w:tcW w:w="4406" w:type="dxa"/>
+            <w:tcW w:w="3178" w:type="dxa"/>
             <w:tcBorders/>
             <w:vAlign w:val="center"/>
           </w:tcPr>
@@ -1719,7 +1743,7 @@
         </w:tc>
         <w:tc>
           <w:tcPr>
-            <w:tcW w:w="692" w:type="dxa"/>
+            <w:tcW w:w="624" w:type="dxa"/>
             <w:tcBorders/>
             <w:vAlign w:val="center"/>
           </w:tcPr>
@@ -1739,7 +1763,7 @@
         </w:tc>
         <w:tc>
           <w:tcPr>
-            <w:tcW w:w="5269" w:type="dxa"/>
+            <w:tcW w:w="6696" w:type="dxa"/>
             <w:tcBorders/>
             <w:vAlign w:val="center"/>
           </w:tcPr>
@@ -1766,7 +1790,7 @@
         <w:trPr/>
         <w:tc>
           <w:tcPr>
-            <w:tcW w:w="972" w:type="dxa"/>
+            <w:tcW w:w="841" w:type="dxa"/>
             <w:tcBorders/>
             <w:vAlign w:val="center"/>
           </w:tcPr>
@@ -1786,7 +1810,7 @@
         </w:tc>
         <w:tc>
           <w:tcPr>
-            <w:tcW w:w="4406" w:type="dxa"/>
+            <w:tcW w:w="3178" w:type="dxa"/>
             <w:tcBorders/>
             <w:vAlign w:val="center"/>
           </w:tcPr>
@@ -1806,7 +1830,7 @@
         </w:tc>
         <w:tc>
           <w:tcPr>
-            <w:tcW w:w="692" w:type="dxa"/>
+            <w:tcW w:w="624" w:type="dxa"/>
             <w:tcBorders/>
             <w:vAlign w:val="center"/>
           </w:tcPr>
@@ -1826,7 +1850,7 @@
         </w:tc>
         <w:tc>
           <w:tcPr>
-            <w:tcW w:w="5269" w:type="dxa"/>
+            <w:tcW w:w="6696" w:type="dxa"/>
             <w:tcBorders/>
             <w:vAlign w:val="center"/>
           </w:tcPr>
@@ -1861,7 +1885,7 @@
         <w:trPr/>
         <w:tc>
           <w:tcPr>
-            <w:tcW w:w="972" w:type="dxa"/>
+            <w:tcW w:w="841" w:type="dxa"/>
             <w:tcBorders/>
             <w:vAlign w:val="center"/>
           </w:tcPr>
@@ -1881,7 +1905,7 @@
         </w:tc>
         <w:tc>
           <w:tcPr>
-            <w:tcW w:w="4406" w:type="dxa"/>
+            <w:tcW w:w="3178" w:type="dxa"/>
             <w:tcBorders/>
             <w:vAlign w:val="center"/>
           </w:tcPr>
@@ -1901,7 +1925,7 @@
         </w:tc>
         <w:tc>
           <w:tcPr>
-            <w:tcW w:w="692" w:type="dxa"/>
+            <w:tcW w:w="624" w:type="dxa"/>
             <w:tcBorders/>
             <w:vAlign w:val="center"/>
           </w:tcPr>
@@ -1925,7 +1949,7 @@
         </w:tc>
         <w:tc>
           <w:tcPr>
-            <w:tcW w:w="5269" w:type="dxa"/>
+            <w:tcW w:w="6696" w:type="dxa"/>
             <w:tcBorders/>
             <w:vAlign w:val="center"/>
           </w:tcPr>
@@ -1960,7 +1984,7 @@
         <w:trPr/>
         <w:tc>
           <w:tcPr>
-            <w:tcW w:w="972" w:type="dxa"/>
+            <w:tcW w:w="841" w:type="dxa"/>
             <w:tcBorders/>
             <w:vAlign w:val="center"/>
           </w:tcPr>
@@ -1980,7 +2004,7 @@
         </w:tc>
         <w:tc>
           <w:tcPr>
-            <w:tcW w:w="4406" w:type="dxa"/>
+            <w:tcW w:w="3178" w:type="dxa"/>
             <w:tcBorders/>
             <w:vAlign w:val="center"/>
           </w:tcPr>
@@ -2000,45 +2024,91 @@
         </w:tc>
         <w:tc>
           <w:tcPr>
-            <w:tcW w:w="692" w:type="dxa"/>
-            <w:tcBorders/>
-            <w:vAlign w:val="center"/>
-          </w:tcPr>
-          <w:p>
-            <w:pPr>
-              <w:pStyle w:val="Style14"/>
-              <w:bidi w:val="0"/>
-              <w:spacing w:before="0" w:after="283"/>
-              <w:jc w:val="left"/>
+            <w:tcW w:w="624" w:type="dxa"/>
+            <w:tcBorders/>
+            <w:vAlign w:val="center"/>
+          </w:tcPr>
+          <w:p>
+            <w:pPr>
+              <w:pStyle w:val="Style14"/>
+              <w:bidi w:val="0"/>
+              <w:spacing w:before="0" w:after="283"/>
+              <w:jc w:val="left"/>
+              <w:rPr/>
+            </w:pPr>
+            <w:r>
+              <w:rPr/>
+              <w:t>已实现</w:t>
+            </w:r>
+          </w:p>
+        </w:tc>
+        <w:tc>
+          <w:tcPr>
+            <w:tcW w:w="6696" w:type="dxa"/>
+            <w:tcBorders/>
+            <w:vAlign w:val="center"/>
+          </w:tcPr>
+          <w:p>
+            <w:pPr>
+              <w:pStyle w:val="Style14"/>
+              <w:bidi w:val="0"/>
+              <w:spacing w:before="0" w:after="283"/>
+              <w:jc w:val="left"/>
+              <w:rPr/>
+            </w:pPr>
+            <w:r>
+              <w:rPr/>
+              <w:t>`GET/PUT /api/user/profile`</w:t>
+            </w:r>
+            <w:r>
+              <w:rPr/>
+              <w:t>（昵称</w:t>
+            </w:r>
+            <w:r>
+              <w:rPr/>
+              <w:t>/</w:t>
+            </w:r>
+            <w:r>
+              <w:rPr/>
+              <w:t>邮箱</w:t>
+            </w:r>
+            <w:r>
+              <w:rPr/>
+              <w:t>/</w:t>
+            </w:r>
+            <w:r>
+              <w:rPr/>
+              <w:t>手机</w:t>
+            </w:r>
+            <w:r>
+              <w:rPr/>
+              <w:t>/</w:t>
+            </w:r>
+            <w:r>
+              <w:rPr/>
+              <w:t>地址）</w:t>
+            </w:r>
+            <w:r>
+              <w:rPr/>
+              <w:t>+ `POST /api/user/avatar`</w:t>
+            </w:r>
+            <w:r>
+              <w:rPr/>
+              <w:t xml:space="preserve">；页面 </w:t>
+            </w:r>
+            <w:r>
+              <w:rPr/>
+              <w:t>`Profile.vue`</w:t>
+            </w:r>
+            <w:r>
+              <w:rPr/>
+              <w:t>；</w:t>
+            </w:r>
+            <w:r>
               <w:rPr>
                 <w:b/>
               </w:rPr>
-            </w:pPr>
-            <w:r>
-              <w:rPr>
-                <w:b/>
-              </w:rPr>
-              <w:t>未实现</w:t>
-            </w:r>
-          </w:p>
-        </w:tc>
-        <w:tc>
-          <w:tcPr>
-            <w:tcW w:w="5269" w:type="dxa"/>
-            <w:tcBorders/>
-            <w:vAlign w:val="center"/>
-          </w:tcPr>
-          <w:p>
-            <w:pPr>
-              <w:pStyle w:val="Style14"/>
-              <w:bidi w:val="0"/>
-              <w:spacing w:before="0" w:after="283"/>
-              <w:jc w:val="left"/>
-              <w:rPr/>
-            </w:pPr>
-            <w:r>
-              <w:rPr/>
-              <w:t>无接口、无页面，属已知缺口</w:t>
+              <w:t>改密未提供</w:t>
             </w:r>
           </w:p>
         </w:tc>
@@ -2047,7 +2117,7 @@
         <w:trPr/>
         <w:tc>
           <w:tcPr>
-            <w:tcW w:w="972" w:type="dxa"/>
+            <w:tcW w:w="841" w:type="dxa"/>
             <w:tcBorders/>
             <w:vAlign w:val="center"/>
           </w:tcPr>
@@ -2067,7 +2137,7 @@
         </w:tc>
         <w:tc>
           <w:tcPr>
-            <w:tcW w:w="4406" w:type="dxa"/>
+            <w:tcW w:w="3178" w:type="dxa"/>
             <w:tcBorders/>
             <w:vAlign w:val="center"/>
           </w:tcPr>
@@ -2087,7 +2157,7 @@
         </w:tc>
         <w:tc>
           <w:tcPr>
-            <w:tcW w:w="692" w:type="dxa"/>
+            <w:tcW w:w="624" w:type="dxa"/>
             <w:tcBorders/>
             <w:vAlign w:val="center"/>
           </w:tcPr>
@@ -2107,7 +2177,7 @@
         </w:tc>
         <w:tc>
           <w:tcPr>
-            <w:tcW w:w="5269" w:type="dxa"/>
+            <w:tcW w:w="6696" w:type="dxa"/>
             <w:tcBorders/>
             <w:vAlign w:val="center"/>
           </w:tcPr>
@@ -2130,7 +2200,7 @@
         <w:trPr/>
         <w:tc>
           <w:tcPr>
-            <w:tcW w:w="972" w:type="dxa"/>
+            <w:tcW w:w="841" w:type="dxa"/>
             <w:tcBorders/>
             <w:vAlign w:val="center"/>
           </w:tcPr>
@@ -2150,7 +2220,7 @@
         </w:tc>
         <w:tc>
           <w:tcPr>
-            <w:tcW w:w="4406" w:type="dxa"/>
+            <w:tcW w:w="3178" w:type="dxa"/>
             <w:tcBorders/>
             <w:vAlign w:val="center"/>
           </w:tcPr>
@@ -2170,7 +2240,7 @@
         </w:tc>
         <w:tc>
           <w:tcPr>
-            <w:tcW w:w="692" w:type="dxa"/>
+            <w:tcW w:w="624" w:type="dxa"/>
             <w:tcBorders/>
             <w:vAlign w:val="center"/>
           </w:tcPr>
@@ -2190,7 +2260,7 @@
         </w:tc>
         <w:tc>
           <w:tcPr>
-            <w:tcW w:w="5269" w:type="dxa"/>
+            <w:tcW w:w="6696" w:type="dxa"/>
             <w:tcBorders/>
             <w:vAlign w:val="center"/>
           </w:tcPr>
@@ -2213,7 +2283,7 @@
         <w:trPr/>
         <w:tc>
           <w:tcPr>
-            <w:tcW w:w="972" w:type="dxa"/>
+            <w:tcW w:w="841" w:type="dxa"/>
             <w:tcBorders/>
             <w:vAlign w:val="center"/>
           </w:tcPr>
@@ -2233,7 +2303,7 @@
         </w:tc>
         <w:tc>
           <w:tcPr>
-            <w:tcW w:w="4406" w:type="dxa"/>
+            <w:tcW w:w="3178" w:type="dxa"/>
             <w:tcBorders/>
             <w:vAlign w:val="center"/>
           </w:tcPr>
@@ -2253,7 +2323,7 @@
         </w:tc>
         <w:tc>
           <w:tcPr>
-            <w:tcW w:w="692" w:type="dxa"/>
+            <w:tcW w:w="624" w:type="dxa"/>
             <w:tcBorders/>
             <w:vAlign w:val="center"/>
           </w:tcPr>
@@ -2273,7 +2343,7 @@
         </w:tc>
         <w:tc>
           <w:tcPr>
-            <w:tcW w:w="5269" w:type="dxa"/>
+            <w:tcW w:w="6696" w:type="dxa"/>
             <w:tcBorders/>
             <w:vAlign w:val="center"/>
           </w:tcPr>
@@ -2296,7 +2366,7 @@
         <w:trPr/>
         <w:tc>
           <w:tcPr>
-            <w:tcW w:w="972" w:type="dxa"/>
+            <w:tcW w:w="841" w:type="dxa"/>
             <w:tcBorders/>
             <w:vAlign w:val="center"/>
           </w:tcPr>
@@ -2316,7 +2386,7 @@
         </w:tc>
         <w:tc>
           <w:tcPr>
-            <w:tcW w:w="4406" w:type="dxa"/>
+            <w:tcW w:w="3178" w:type="dxa"/>
             <w:tcBorders/>
             <w:vAlign w:val="center"/>
           </w:tcPr>
@@ -2336,7 +2406,7 @@
         </w:tc>
         <w:tc>
           <w:tcPr>
-            <w:tcW w:w="692" w:type="dxa"/>
+            <w:tcW w:w="624" w:type="dxa"/>
             <w:tcBorders/>
             <w:vAlign w:val="center"/>
           </w:tcPr>
@@ -2356,7 +2426,7 @@
         </w:tc>
         <w:tc>
           <w:tcPr>
-            <w:tcW w:w="5269" w:type="dxa"/>
+            <w:tcW w:w="6696" w:type="dxa"/>
             <w:tcBorders/>
             <w:vAlign w:val="center"/>
           </w:tcPr>
@@ -2395,7 +2465,7 @@
         <w:trPr/>
         <w:tc>
           <w:tcPr>
-            <w:tcW w:w="972" w:type="dxa"/>
+            <w:tcW w:w="841" w:type="dxa"/>
             <w:tcBorders/>
             <w:vAlign w:val="center"/>
           </w:tcPr>
@@ -2415,7 +2485,7 @@
         </w:tc>
         <w:tc>
           <w:tcPr>
-            <w:tcW w:w="4406" w:type="dxa"/>
+            <w:tcW w:w="3178" w:type="dxa"/>
             <w:tcBorders/>
             <w:vAlign w:val="center"/>
           </w:tcPr>
@@ -2443,7 +2513,7 @@
         </w:tc>
         <w:tc>
           <w:tcPr>
-            <w:tcW w:w="692" w:type="dxa"/>
+            <w:tcW w:w="624" w:type="dxa"/>
             <w:tcBorders/>
             <w:vAlign w:val="center"/>
           </w:tcPr>
@@ -2463,7 +2533,7 @@
         </w:tc>
         <w:tc>
           <w:tcPr>
-            <w:tcW w:w="5269" w:type="dxa"/>
+            <w:tcW w:w="6696" w:type="dxa"/>
             <w:tcBorders/>
             <w:vAlign w:val="center"/>
           </w:tcPr>
@@ -2494,7 +2564,7 @@
         <w:trPr/>
         <w:tc>
           <w:tcPr>
-            <w:tcW w:w="972" w:type="dxa"/>
+            <w:tcW w:w="841" w:type="dxa"/>
             <w:tcBorders/>
             <w:vAlign w:val="center"/>
           </w:tcPr>
@@ -2514,7 +2584,7 @@
         </w:tc>
         <w:tc>
           <w:tcPr>
-            <w:tcW w:w="4406" w:type="dxa"/>
+            <w:tcW w:w="3178" w:type="dxa"/>
             <w:tcBorders/>
             <w:vAlign w:val="center"/>
           </w:tcPr>
@@ -2542,7 +2612,7 @@
         </w:tc>
         <w:tc>
           <w:tcPr>
-            <w:tcW w:w="692" w:type="dxa"/>
+            <w:tcW w:w="624" w:type="dxa"/>
             <w:tcBorders/>
             <w:vAlign w:val="center"/>
           </w:tcPr>
@@ -2562,7 +2632,7 @@
         </w:tc>
         <w:tc>
           <w:tcPr>
-            <w:tcW w:w="5269" w:type="dxa"/>
+            <w:tcW w:w="6696" w:type="dxa"/>
             <w:tcBorders/>
             <w:vAlign w:val="center"/>
           </w:tcPr>
@@ -2601,7 +2671,7 @@
         <w:trPr/>
         <w:tc>
           <w:tcPr>
-            <w:tcW w:w="972" w:type="dxa"/>
+            <w:tcW w:w="841" w:type="dxa"/>
             <w:tcBorders/>
             <w:vAlign w:val="center"/>
           </w:tcPr>
@@ -2621,7 +2691,7 @@
         </w:tc>
         <w:tc>
           <w:tcPr>
-            <w:tcW w:w="4406" w:type="dxa"/>
+            <w:tcW w:w="3178" w:type="dxa"/>
             <w:tcBorders/>
             <w:vAlign w:val="center"/>
           </w:tcPr>
@@ -2649,7 +2719,7 @@
         </w:tc>
         <w:tc>
           <w:tcPr>
-            <w:tcW w:w="692" w:type="dxa"/>
+            <w:tcW w:w="624" w:type="dxa"/>
             <w:tcBorders/>
             <w:vAlign w:val="center"/>
           </w:tcPr>
@@ -2669,7 +2739,7 @@
         </w:tc>
         <w:tc>
           <w:tcPr>
-            <w:tcW w:w="5269" w:type="dxa"/>
+            <w:tcW w:w="6696" w:type="dxa"/>
             <w:tcBorders/>
             <w:vAlign w:val="center"/>
           </w:tcPr>
@@ -2700,7 +2770,7 @@
         <w:trPr/>
         <w:tc>
           <w:tcPr>
-            <w:tcW w:w="972" w:type="dxa"/>
+            <w:tcW w:w="841" w:type="dxa"/>
             <w:tcBorders/>
             <w:vAlign w:val="center"/>
           </w:tcPr>
@@ -2720,7 +2790,7 @@
         </w:tc>
         <w:tc>
           <w:tcPr>
-            <w:tcW w:w="4406" w:type="dxa"/>
+            <w:tcW w:w="3178" w:type="dxa"/>
             <w:tcBorders/>
             <w:vAlign w:val="center"/>
           </w:tcPr>
@@ -2740,7 +2810,7 @@
         </w:tc>
         <w:tc>
           <w:tcPr>
-            <w:tcW w:w="692" w:type="dxa"/>
+            <w:tcW w:w="624" w:type="dxa"/>
             <w:tcBorders/>
             <w:vAlign w:val="center"/>
           </w:tcPr>
@@ -2760,7 +2830,7 @@
         </w:tc>
         <w:tc>
           <w:tcPr>
-            <w:tcW w:w="5269" w:type="dxa"/>
+            <w:tcW w:w="6696" w:type="dxa"/>
             <w:tcBorders/>
             <w:vAlign w:val="center"/>
           </w:tcPr>
@@ -2791,7 +2861,7 @@
         <w:trPr/>
         <w:tc>
           <w:tcPr>
-            <w:tcW w:w="972" w:type="dxa"/>
+            <w:tcW w:w="841" w:type="dxa"/>
             <w:tcBorders/>
             <w:vAlign w:val="center"/>
           </w:tcPr>
@@ -2811,7 +2881,7 @@
         </w:tc>
         <w:tc>
           <w:tcPr>
-            <w:tcW w:w="4406" w:type="dxa"/>
+            <w:tcW w:w="3178" w:type="dxa"/>
             <w:tcBorders/>
             <w:vAlign w:val="center"/>
           </w:tcPr>
@@ -2831,7 +2901,7 @@
         </w:tc>
         <w:tc>
           <w:tcPr>
-            <w:tcW w:w="692" w:type="dxa"/>
+            <w:tcW w:w="624" w:type="dxa"/>
             <w:tcBorders/>
             <w:vAlign w:val="center"/>
           </w:tcPr>
@@ -2851,7 +2921,7 @@
         </w:tc>
         <w:tc>
           <w:tcPr>
-            <w:tcW w:w="5269" w:type="dxa"/>
+            <w:tcW w:w="6696" w:type="dxa"/>
             <w:tcBorders/>
             <w:vAlign w:val="center"/>
           </w:tcPr>
@@ -2882,7 +2952,7 @@
         <w:trPr/>
         <w:tc>
           <w:tcPr>
-            <w:tcW w:w="972" w:type="dxa"/>
+            <w:tcW w:w="841" w:type="dxa"/>
             <w:tcBorders/>
             <w:vAlign w:val="center"/>
           </w:tcPr>
@@ -2902,7 +2972,7 @@
         </w:tc>
         <w:tc>
           <w:tcPr>
-            <w:tcW w:w="4406" w:type="dxa"/>
+            <w:tcW w:w="3178" w:type="dxa"/>
             <w:tcBorders/>
             <w:vAlign w:val="center"/>
           </w:tcPr>
@@ -2922,7 +2992,7 @@
         </w:tc>
         <w:tc>
           <w:tcPr>
-            <w:tcW w:w="692" w:type="dxa"/>
+            <w:tcW w:w="624" w:type="dxa"/>
             <w:tcBorders/>
             <w:vAlign w:val="center"/>
           </w:tcPr>
@@ -2942,7 +3012,7 @@
         </w:tc>
         <w:tc>
           <w:tcPr>
-            <w:tcW w:w="5269" w:type="dxa"/>
+            <w:tcW w:w="6696" w:type="dxa"/>
             <w:tcBorders/>
             <w:vAlign w:val="center"/>
           </w:tcPr>
@@ -2969,7 +3039,7 @@
         <w:trPr/>
         <w:tc>
           <w:tcPr>
-            <w:tcW w:w="972" w:type="dxa"/>
+            <w:tcW w:w="841" w:type="dxa"/>
             <w:tcBorders/>
             <w:vAlign w:val="center"/>
           </w:tcPr>
@@ -2989,7 +3059,7 @@
         </w:tc>
         <w:tc>
           <w:tcPr>
-            <w:tcW w:w="4406" w:type="dxa"/>
+            <w:tcW w:w="3178" w:type="dxa"/>
             <w:tcBorders/>
             <w:vAlign w:val="center"/>
           </w:tcPr>
@@ -3033,7 +3103,7 @@
         </w:tc>
         <w:tc>
           <w:tcPr>
-            <w:tcW w:w="692" w:type="dxa"/>
+            <w:tcW w:w="624" w:type="dxa"/>
             <w:tcBorders/>
             <w:vAlign w:val="center"/>
           </w:tcPr>
@@ -3053,7 +3123,7 @@
         </w:tc>
         <w:tc>
           <w:tcPr>
-            <w:tcW w:w="5269" w:type="dxa"/>
+            <w:tcW w:w="6696" w:type="dxa"/>
             <w:tcBorders/>
             <w:vAlign w:val="center"/>
           </w:tcPr>
@@ -3084,7 +3154,7 @@
         <w:trPr/>
         <w:tc>
           <w:tcPr>
-            <w:tcW w:w="972" w:type="dxa"/>
+            <w:tcW w:w="841" w:type="dxa"/>
             <w:tcBorders/>
             <w:vAlign w:val="center"/>
           </w:tcPr>
@@ -3104,7 +3174,7 @@
         </w:tc>
         <w:tc>
           <w:tcPr>
-            <w:tcW w:w="4406" w:type="dxa"/>
+            <w:tcW w:w="3178" w:type="dxa"/>
             <w:tcBorders/>
             <w:vAlign w:val="center"/>
           </w:tcPr>
@@ -3124,7 +3194,7 @@
         </w:tc>
         <w:tc>
           <w:tcPr>
-            <w:tcW w:w="692" w:type="dxa"/>
+            <w:tcW w:w="624" w:type="dxa"/>
             <w:tcBorders/>
             <w:vAlign w:val="center"/>
           </w:tcPr>
@@ -3144,7 +3214,7 @@
         </w:tc>
         <w:tc>
           <w:tcPr>
-            <w:tcW w:w="5269" w:type="dxa"/>
+            <w:tcW w:w="6696" w:type="dxa"/>
             <w:tcBorders/>
             <w:vAlign w:val="center"/>
           </w:tcPr>
@@ -3167,7 +3237,7 @@
         <w:trPr/>
         <w:tc>
           <w:tcPr>
-            <w:tcW w:w="972" w:type="dxa"/>
+            <w:tcW w:w="841" w:type="dxa"/>
             <w:tcBorders/>
             <w:vAlign w:val="center"/>
           </w:tcPr>
@@ -3187,7 +3257,7 @@
         </w:tc>
         <w:tc>
           <w:tcPr>
-            <w:tcW w:w="4406" w:type="dxa"/>
+            <w:tcW w:w="3178" w:type="dxa"/>
             <w:tcBorders/>
             <w:vAlign w:val="center"/>
           </w:tcPr>
@@ -3207,7 +3277,7 @@
         </w:tc>
         <w:tc>
           <w:tcPr>
-            <w:tcW w:w="692" w:type="dxa"/>
+            <w:tcW w:w="624" w:type="dxa"/>
             <w:tcBorders/>
             <w:vAlign w:val="center"/>
           </w:tcPr>
@@ -3227,7 +3297,7 @@
         </w:tc>
         <w:tc>
           <w:tcPr>
-            <w:tcW w:w="5269" w:type="dxa"/>
+            <w:tcW w:w="6696" w:type="dxa"/>
             <w:tcBorders/>
             <w:vAlign w:val="center"/>
           </w:tcPr>
@@ -3250,7 +3320,7 @@
         <w:trPr/>
         <w:tc>
           <w:tcPr>
-            <w:tcW w:w="972" w:type="dxa"/>
+            <w:tcW w:w="841" w:type="dxa"/>
             <w:tcBorders/>
             <w:vAlign w:val="center"/>
           </w:tcPr>
@@ -3270,7 +3340,7 @@
         </w:tc>
         <w:tc>
           <w:tcPr>
-            <w:tcW w:w="4406" w:type="dxa"/>
+            <w:tcW w:w="3178" w:type="dxa"/>
             <w:tcBorders/>
             <w:vAlign w:val="center"/>
           </w:tcPr>
@@ -3314,7 +3384,7 @@
         </w:tc>
         <w:tc>
           <w:tcPr>
-            <w:tcW w:w="692" w:type="dxa"/>
+            <w:tcW w:w="624" w:type="dxa"/>
             <w:tcBorders/>
             <w:vAlign w:val="center"/>
           </w:tcPr>
@@ -3334,7 +3404,7 @@
         </w:tc>
         <w:tc>
           <w:tcPr>
-            <w:tcW w:w="5269" w:type="dxa"/>
+            <w:tcW w:w="6696" w:type="dxa"/>
             <w:tcBorders/>
             <w:vAlign w:val="center"/>
           </w:tcPr>
@@ -3361,7 +3431,7 @@
         <w:trPr/>
         <w:tc>
           <w:tcPr>
-            <w:tcW w:w="972" w:type="dxa"/>
+            <w:tcW w:w="841" w:type="dxa"/>
             <w:tcBorders/>
             <w:vAlign w:val="center"/>
           </w:tcPr>
@@ -3381,7 +3451,7 @@
         </w:tc>
         <w:tc>
           <w:tcPr>
-            <w:tcW w:w="4406" w:type="dxa"/>
+            <w:tcW w:w="3178" w:type="dxa"/>
             <w:tcBorders/>
             <w:vAlign w:val="center"/>
           </w:tcPr>
@@ -3401,7 +3471,7 @@
         </w:tc>
         <w:tc>
           <w:tcPr>
-            <w:tcW w:w="692" w:type="dxa"/>
+            <w:tcW w:w="624" w:type="dxa"/>
             <w:tcBorders/>
             <w:vAlign w:val="center"/>
           </w:tcPr>
@@ -3421,7 +3491,7 @@
         </w:tc>
         <w:tc>
           <w:tcPr>
-            <w:tcW w:w="5269" w:type="dxa"/>
+            <w:tcW w:w="6696" w:type="dxa"/>
             <w:tcBorders/>
             <w:vAlign w:val="center"/>
           </w:tcPr>
@@ -3476,7 +3546,7 @@
         <w:rPr>
           <w:b/>
         </w:rPr>
-        <w:t xml:space="preserve">20 </w:t>
+        <w:t xml:space="preserve">21 </w:t>
       </w:r>
       <w:r>
         <w:rPr>
@@ -3488,7 +3558,7 @@
         <w:rPr>
           <w:b/>
         </w:rPr>
-        <w:t xml:space="preserve">2 </w:t>
+        <w:t xml:space="preserve">1 </w:t>
       </w:r>
       <w:r>
         <w:rPr>
@@ -3500,25 +3570,13 @@
         <w:rPr>
           <w:b/>
         </w:rPr>
-        <w:t>F1.3</w:t>
+        <w:t xml:space="preserve">F1.3 </w:t>
       </w:r>
       <w:r>
         <w:rPr>
           <w:b/>
         </w:rPr>
-        <w:t>、</w:t>
-      </w:r>
-      <w:r>
-        <w:rPr>
-          <w:b/>
-        </w:rPr>
-        <w:t>F1.4</w:t>
-      </w:r>
-      <w:r>
-        <w:rPr>
-          <w:b/>
-        </w:rPr>
-        <w:t>）明确未实现</w:t>
+        <w:t>服务端注销）未实现</w:t>
       </w:r>
       <w:r>
         <w:rPr/>
@@ -3531,6 +3589,22 @@
       <w:r>
         <w:rPr/>
         <w:t>节登记为遗留项。</w:t>
+      </w:r>
+      <w:r>
+        <w:rPr/>
+        <w:t xml:space="preserve">F1.4 </w:t>
+      </w:r>
+      <w:r>
+        <w:rPr/>
+        <w:t xml:space="preserve">原标注为未实现属于文档滞后——接口、页面与 </w:t>
+      </w:r>
+      <w:r>
+        <w:rPr/>
+        <w:t xml:space="preserve">`V3__user_profile.sql` </w:t>
+      </w:r>
+      <w:r>
+        <w:rPr/>
+        <w:t>均在仓库中，仅「修改密码」仍需补。</w:t>
       </w:r>
     </w:p>
     <w:p>
@@ -7672,7 +7746,7 @@
     </w:p>
     <w:tbl>
       <w:tblPr>
-        <w:tblW w:w="11296" w:type="dxa"/>
+        <w:tblW w:w="11339" w:type="dxa"/>
         <w:jc w:val="left"/>
         <w:tblInd w:w="28" w:type="dxa"/>
         <w:tblLayout w:type="fixed"/>
@@ -7684,15 +7758,15 @@
         </w:tblCellMar>
       </w:tblPr>
       <w:tblGrid>
-        <w:gridCol w:w="3181"/>
-        <w:gridCol w:w="4580"/>
-        <w:gridCol w:w="3535"/>
+        <w:gridCol w:w="2863"/>
+        <w:gridCol w:w="4907"/>
+        <w:gridCol w:w="3569"/>
       </w:tblGrid>
       <w:tr>
         <w:trPr/>
         <w:tc>
           <w:tcPr>
-            <w:tcW w:w="3181" w:type="dxa"/>
+            <w:tcW w:w="2863" w:type="dxa"/>
             <w:tcBorders/>
             <w:vAlign w:val="center"/>
           </w:tcPr>
@@ -7714,7 +7788,7 @@
         </w:tc>
         <w:tc>
           <w:tcPr>
-            <w:tcW w:w="4580" w:type="dxa"/>
+            <w:tcW w:w="4907" w:type="dxa"/>
             <w:tcBorders/>
             <w:vAlign w:val="center"/>
           </w:tcPr>
@@ -7736,7 +7810,7 @@
         </w:tc>
         <w:tc>
           <w:tcPr>
-            <w:tcW w:w="3535" w:type="dxa"/>
+            <w:tcW w:w="3569" w:type="dxa"/>
             <w:tcBorders/>
             <w:vAlign w:val="center"/>
           </w:tcPr>
@@ -7761,7 +7835,7 @@
         <w:trPr/>
         <w:tc>
           <w:tcPr>
-            <w:tcW w:w="3181" w:type="dxa"/>
+            <w:tcW w:w="2863" w:type="dxa"/>
             <w:tcBorders/>
             <w:vAlign w:val="center"/>
           </w:tcPr>
@@ -7779,41 +7853,45 @@
             </w:r>
             <w:r>
               <w:rPr/>
-              <w:t xml:space="preserve">退出 </w:t>
-            </w:r>
-            <w:r>
-              <w:rPr/>
-              <w:t xml:space="preserve">/ F1.4 </w:t>
-            </w:r>
-            <w:r>
-              <w:rPr/>
-              <w:t>个人信息维护</w:t>
-            </w:r>
-          </w:p>
-        </w:tc>
-        <w:tc>
-          <w:tcPr>
-            <w:tcW w:w="4580" w:type="dxa"/>
-            <w:tcBorders/>
-            <w:vAlign w:val="center"/>
-          </w:tcPr>
-          <w:p>
-            <w:pPr>
-              <w:pStyle w:val="Style14"/>
-              <w:bidi w:val="0"/>
-              <w:spacing w:before="0" w:after="283"/>
-              <w:jc w:val="left"/>
-              <w:rPr/>
-            </w:pPr>
-            <w:r>
-              <w:rPr/>
-              <w:t>用户无法改昵称、邮箱、密码</w:t>
-            </w:r>
-          </w:p>
-        </w:tc>
-        <w:tc>
-          <w:tcPr>
-            <w:tcW w:w="3535" w:type="dxa"/>
+              <w:t>服务端注销</w:t>
+            </w:r>
+          </w:p>
+        </w:tc>
+        <w:tc>
+          <w:tcPr>
+            <w:tcW w:w="4907" w:type="dxa"/>
+            <w:tcBorders/>
+            <w:vAlign w:val="center"/>
+          </w:tcPr>
+          <w:p>
+            <w:pPr>
+              <w:pStyle w:val="Style14"/>
+              <w:bidi w:val="0"/>
+              <w:spacing w:before="0" w:after="283"/>
+              <w:jc w:val="left"/>
+              <w:rPr/>
+            </w:pPr>
+            <w:r>
+              <w:rPr/>
+              <w:t xml:space="preserve">JWT </w:t>
+            </w:r>
+            <w:r>
+              <w:rPr/>
+              <w:t xml:space="preserve">无状态，前端清 </w:t>
+            </w:r>
+            <w:r>
+              <w:rPr/>
+              <w:t xml:space="preserve">token </w:t>
+            </w:r>
+            <w:r>
+              <w:rPr/>
+              <w:t>即可，但无法主动吊销被盗令牌</w:t>
+            </w:r>
+          </w:p>
+        </w:tc>
+        <w:tc>
+          <w:tcPr>
+            <w:tcW w:w="3569" w:type="dxa"/>
             <w:tcBorders/>
             <w:vAlign w:val="center"/>
           </w:tcPr>
@@ -7835,11 +7913,7 @@
             </w:r>
             <w:r>
               <w:rPr/>
-              <w:t xml:space="preserve">，补 </w:t>
-            </w:r>
-            <w:r>
-              <w:rPr/>
-              <w:t>`PUT /api/auth/profile`</w:t>
+              <w:t>，加令牌黑名单</w:t>
             </w:r>
           </w:p>
         </w:tc>
@@ -7848,47 +7922,83 @@
         <w:trPr/>
         <w:tc>
           <w:tcPr>
-            <w:tcW w:w="3181" w:type="dxa"/>
-            <w:tcBorders/>
-            <w:vAlign w:val="center"/>
-          </w:tcPr>
-          <w:p>
-            <w:pPr>
-              <w:pStyle w:val="Style14"/>
-              <w:bidi w:val="0"/>
-              <w:spacing w:before="0" w:after="283"/>
-              <w:jc w:val="left"/>
-              <w:rPr/>
-            </w:pPr>
-            <w:r>
-              <w:rPr/>
-              <w:t>评测口径未排除训练集已交互物品</w:t>
-            </w:r>
-          </w:p>
-        </w:tc>
-        <w:tc>
-          <w:tcPr>
-            <w:tcW w:w="4580" w:type="dxa"/>
-            <w:tcBorders/>
-            <w:vAlign w:val="center"/>
-          </w:tcPr>
-          <w:p>
-            <w:pPr>
-              <w:pStyle w:val="Style14"/>
-              <w:bidi w:val="0"/>
-              <w:spacing w:before="0" w:after="283"/>
-              <w:jc w:val="left"/>
-              <w:rPr/>
-            </w:pPr>
-            <w:r>
-              <w:rPr/>
-              <w:t>指标被系统性低估，无法判断真实效果</w:t>
-            </w:r>
-          </w:p>
-        </w:tc>
-        <w:tc>
-          <w:tcPr>
-            <w:tcW w:w="3535" w:type="dxa"/>
+            <w:tcW w:w="2863" w:type="dxa"/>
+            <w:tcBorders/>
+            <w:vAlign w:val="center"/>
+          </w:tcPr>
+          <w:p>
+            <w:pPr>
+              <w:pStyle w:val="Style14"/>
+              <w:bidi w:val="0"/>
+              <w:spacing w:before="0" w:after="283"/>
+              <w:jc w:val="left"/>
+              <w:rPr/>
+            </w:pPr>
+            <w:r>
+              <w:rPr/>
+              <w:t xml:space="preserve">F1.4 </w:t>
+            </w:r>
+            <w:r>
+              <w:rPr/>
+              <w:t>修改密码</w:t>
+            </w:r>
+          </w:p>
+        </w:tc>
+        <w:tc>
+          <w:tcPr>
+            <w:tcW w:w="4907" w:type="dxa"/>
+            <w:tcBorders/>
+            <w:vAlign w:val="center"/>
+          </w:tcPr>
+          <w:p>
+            <w:pPr>
+              <w:pStyle w:val="Style14"/>
+              <w:bidi w:val="0"/>
+              <w:spacing w:before="0" w:after="283"/>
+              <w:jc w:val="left"/>
+              <w:rPr/>
+            </w:pPr>
+            <w:r>
+              <w:rPr/>
+              <w:t>昵称</w:t>
+            </w:r>
+            <w:r>
+              <w:rPr/>
+              <w:t>/</w:t>
+            </w:r>
+            <w:r>
+              <w:rPr/>
+              <w:t>邮箱</w:t>
+            </w:r>
+            <w:r>
+              <w:rPr/>
+              <w:t>/</w:t>
+            </w:r>
+            <w:r>
+              <w:rPr/>
+              <w:t>手机</w:t>
+            </w:r>
+            <w:r>
+              <w:rPr/>
+              <w:t>/</w:t>
+            </w:r>
+            <w:r>
+              <w:rPr/>
+              <w:t>地址</w:t>
+            </w:r>
+            <w:r>
+              <w:rPr/>
+              <w:t>/</w:t>
+            </w:r>
+            <w:r>
+              <w:rPr/>
+              <w:t>头像均可改，唯独改不了密码</w:t>
+            </w:r>
+          </w:p>
+        </w:tc>
+        <w:tc>
+          <w:tcPr>
+            <w:tcW w:w="3569" w:type="dxa"/>
             <w:tcBorders/>
             <w:vAlign w:val="center"/>
           </w:tcPr>
@@ -7906,15 +8016,15 @@
             </w:r>
             <w:r>
               <w:rPr/>
-              <w:t>P0</w:t>
-            </w:r>
-            <w:r>
-              <w:rPr/>
-              <w:t xml:space="preserve">，见 </w:t>
-            </w:r>
-            <w:r>
-              <w:rPr/>
-              <w:t>8.1</w:t>
+              <w:t>P1</w:t>
+            </w:r>
+            <w:r>
+              <w:rPr/>
+              <w:t xml:space="preserve">，补 </w:t>
+            </w:r>
+            <w:r>
+              <w:rPr/>
+              <w:t>`PUT /api/user/password`</w:t>
             </w:r>
           </w:p>
         </w:tc>
@@ -7923,55 +8033,47 @@
         <w:trPr/>
         <w:tc>
           <w:tcPr>
-            <w:tcW w:w="3181" w:type="dxa"/>
-            <w:tcBorders/>
-            <w:vAlign w:val="center"/>
-          </w:tcPr>
-          <w:p>
-            <w:pPr>
-              <w:pStyle w:val="Style14"/>
-              <w:bidi w:val="0"/>
-              <w:spacing w:before="0" w:after="283"/>
-              <w:jc w:val="left"/>
-              <w:rPr/>
-            </w:pPr>
-            <w:r>
-              <w:rPr/>
-              <w:t>日志只打控制台</w:t>
-            </w:r>
-          </w:p>
-        </w:tc>
-        <w:tc>
-          <w:tcPr>
-            <w:tcW w:w="4580" w:type="dxa"/>
-            <w:tcBorders/>
-            <w:vAlign w:val="center"/>
-          </w:tcPr>
-          <w:p>
-            <w:pPr>
-              <w:pStyle w:val="Style14"/>
-              <w:bidi w:val="0"/>
-              <w:spacing w:before="0" w:after="283"/>
-              <w:jc w:val="left"/>
-              <w:rPr/>
-            </w:pPr>
-            <w:r>
-              <w:rPr/>
-              <w:t xml:space="preserve">问题现场难以回溯（本次排查 </w:t>
-            </w:r>
-            <w:r>
-              <w:rPr/>
-              <w:t xml:space="preserve">9999 </w:t>
-            </w:r>
-            <w:r>
-              <w:rPr/>
-              <w:t>就受制于此）</w:t>
-            </w:r>
-          </w:p>
-        </w:tc>
-        <w:tc>
-          <w:tcPr>
-            <w:tcW w:w="3535" w:type="dxa"/>
+            <w:tcW w:w="2863" w:type="dxa"/>
+            <w:tcBorders/>
+            <w:vAlign w:val="center"/>
+          </w:tcPr>
+          <w:p>
+            <w:pPr>
+              <w:pStyle w:val="Style14"/>
+              <w:bidi w:val="0"/>
+              <w:spacing w:before="0" w:after="283"/>
+              <w:jc w:val="left"/>
+              <w:rPr/>
+            </w:pPr>
+            <w:r>
+              <w:rPr/>
+              <w:t>评测口径未排除训练集已交互物品</w:t>
+            </w:r>
+          </w:p>
+        </w:tc>
+        <w:tc>
+          <w:tcPr>
+            <w:tcW w:w="4907" w:type="dxa"/>
+            <w:tcBorders/>
+            <w:vAlign w:val="center"/>
+          </w:tcPr>
+          <w:p>
+            <w:pPr>
+              <w:pStyle w:val="Style14"/>
+              <w:bidi w:val="0"/>
+              <w:spacing w:before="0" w:after="283"/>
+              <w:jc w:val="left"/>
+              <w:rPr/>
+            </w:pPr>
+            <w:r>
+              <w:rPr/>
+              <w:t>指标被系统性低估，无法判断真实效果</w:t>
+            </w:r>
+          </w:p>
+        </w:tc>
+        <w:tc>
+          <w:tcPr>
+            <w:tcW w:w="3569" w:type="dxa"/>
             <w:tcBorders/>
             <w:vAlign w:val="center"/>
           </w:tcPr>
@@ -7993,15 +8095,11 @@
             </w:r>
             <w:r>
               <w:rPr/>
-              <w:t>，</w:t>
-            </w:r>
-            <w:r>
-              <w:rPr/>
-              <w:t xml:space="preserve">`logging.file.name` </w:t>
-            </w:r>
-            <w:r>
-              <w:rPr/>
-              <w:t>落盘</w:t>
+              <w:t xml:space="preserve">，见 </w:t>
+            </w:r>
+            <w:r>
+              <w:rPr/>
+              <w:t>8.1</w:t>
             </w:r>
           </w:p>
         </w:tc>
@@ -8010,55 +8108,55 @@
         <w:trPr/>
         <w:tc>
           <w:tcPr>
-            <w:tcW w:w="3181" w:type="dxa"/>
-            <w:tcBorders/>
-            <w:vAlign w:val="center"/>
-          </w:tcPr>
-          <w:p>
-            <w:pPr>
-              <w:pStyle w:val="Style14"/>
-              <w:bidi w:val="0"/>
-              <w:spacing w:before="0" w:after="283"/>
-              <w:jc w:val="left"/>
-              <w:rPr/>
-            </w:pPr>
-            <w:r>
-              <w:rPr/>
-              <w:t>推荐每次全量读行为表</w:t>
-            </w:r>
-          </w:p>
-        </w:tc>
-        <w:tc>
-          <w:tcPr>
-            <w:tcW w:w="4580" w:type="dxa"/>
-            <w:tcBorders/>
-            <w:vAlign w:val="center"/>
-          </w:tcPr>
-          <w:p>
-            <w:pPr>
-              <w:pStyle w:val="Style14"/>
-              <w:bidi w:val="0"/>
-              <w:spacing w:before="0" w:after="283"/>
-              <w:jc w:val="left"/>
-              <w:rPr/>
-            </w:pPr>
-            <w:r>
-              <w:rPr/>
-              <w:t xml:space="preserve">数据量 </w:t>
-            </w:r>
-            <w:r>
-              <w:rPr/>
-              <w:t xml:space="preserve">&gt; 10 </w:t>
-            </w:r>
-            <w:r>
-              <w:rPr/>
-              <w:t>万后响应时间不可控</w:t>
-            </w:r>
-          </w:p>
-        </w:tc>
-        <w:tc>
-          <w:tcPr>
-            <w:tcW w:w="3535" w:type="dxa"/>
+            <w:tcW w:w="2863" w:type="dxa"/>
+            <w:tcBorders/>
+            <w:vAlign w:val="center"/>
+          </w:tcPr>
+          <w:p>
+            <w:pPr>
+              <w:pStyle w:val="Style14"/>
+              <w:bidi w:val="0"/>
+              <w:spacing w:before="0" w:after="283"/>
+              <w:jc w:val="left"/>
+              <w:rPr/>
+            </w:pPr>
+            <w:r>
+              <w:rPr/>
+              <w:t>日志只打控制台</w:t>
+            </w:r>
+          </w:p>
+        </w:tc>
+        <w:tc>
+          <w:tcPr>
+            <w:tcW w:w="4907" w:type="dxa"/>
+            <w:tcBorders/>
+            <w:vAlign w:val="center"/>
+          </w:tcPr>
+          <w:p>
+            <w:pPr>
+              <w:pStyle w:val="Style14"/>
+              <w:bidi w:val="0"/>
+              <w:spacing w:before="0" w:after="283"/>
+              <w:jc w:val="left"/>
+              <w:rPr/>
+            </w:pPr>
+            <w:r>
+              <w:rPr/>
+              <w:t xml:space="preserve">问题现场难以回溯（本次排查 </w:t>
+            </w:r>
+            <w:r>
+              <w:rPr/>
+              <w:t xml:space="preserve">9999 </w:t>
+            </w:r>
+            <w:r>
+              <w:rPr/>
+              <w:t>就受制于此）</w:t>
+            </w:r>
+          </w:p>
+        </w:tc>
+        <w:tc>
+          <w:tcPr>
+            <w:tcW w:w="3569" w:type="dxa"/>
             <w:tcBorders/>
             <w:vAlign w:val="center"/>
           </w:tcPr>
@@ -8076,11 +8174,19 @@
             </w:r>
             <w:r>
               <w:rPr/>
-              <w:t>P1</w:t>
-            </w:r>
-            <w:r>
-              <w:rPr/>
-              <w:t>，加缓存与增量矩阵</w:t>
+              <w:t>P0</w:t>
+            </w:r>
+            <w:r>
+              <w:rPr/>
+              <w:t>，</w:t>
+            </w:r>
+            <w:r>
+              <w:rPr/>
+              <w:t xml:space="preserve">`logging.file.name` </w:t>
+            </w:r>
+            <w:r>
+              <w:rPr/>
+              <w:t>落盘</w:t>
             </w:r>
           </w:p>
         </w:tc>
@@ -8089,7 +8195,7 @@
         <w:trPr/>
         <w:tc>
           <w:tcPr>
-            <w:tcW w:w="3181" w:type="dxa"/>
+            <w:tcW w:w="2863" w:type="dxa"/>
             <w:tcBorders/>
             <w:vAlign w:val="center"/>
           </w:tcPr>
@@ -8109,7 +8215,7 @@
         </w:tc>
         <w:tc>
           <w:tcPr>
-            <w:tcW w:w="4580" w:type="dxa"/>
+            <w:tcW w:w="4907" w:type="dxa"/>
             <w:tcBorders/>
             <w:vAlign w:val="center"/>
           </w:tcPr>
@@ -8129,7 +8235,7 @@
         </w:tc>
         <w:tc>
           <w:tcPr>
-            <w:tcW w:w="3535" w:type="dxa"/>
+            <w:tcW w:w="3569" w:type="dxa"/>
             <w:tcBorders/>
             <w:vAlign w:val="center"/>
           </w:tcPr>
@@ -8156,7 +8262,7 @@
         <w:trPr/>
         <w:tc>
           <w:tcPr>
-            <w:tcW w:w="3181" w:type="dxa"/>
+            <w:tcW w:w="2863" w:type="dxa"/>
             <w:tcBorders/>
             <w:vAlign w:val="center"/>
           </w:tcPr>
@@ -8176,7 +8282,7 @@
         </w:tc>
         <w:tc>
           <w:tcPr>
-            <w:tcW w:w="4580" w:type="dxa"/>
+            <w:tcW w:w="4907" w:type="dxa"/>
             <w:tcBorders/>
             <w:vAlign w:val="center"/>
           </w:tcPr>
@@ -8196,7 +8302,7 @@
         </w:tc>
         <w:tc>
           <w:tcPr>
-            <w:tcW w:w="3535" w:type="dxa"/>
+            <w:tcW w:w="3569" w:type="dxa"/>
             <w:tcBorders/>
             <w:vAlign w:val="center"/>
           </w:tcPr>
@@ -8228,6 +8334,50 @@
         </w:tc>
       </w:tr>
     </w:tbl>
+    <w:p>
+      <w:pPr>
+        <w:pStyle w:val="Style18"/>
+        <w:bidi w:val="0"/>
+        <w:jc w:val="left"/>
+        <w:rPr/>
+      </w:pPr>
+      <w:r>
+        <w:rPr/>
+        <w:t>原表中「推荐每次全量读行为表」一项已在本轮解决：行为矩阵与用户相似邻居改为按版本缓存，</w:t>
+      </w:r>
+      <w:r>
+        <w:rPr/>
+        <w:t xml:space="preserve">`/recommend/home` </w:t>
+      </w:r>
+      <w:r>
+        <w:rPr/>
+        <w:t xml:space="preserve">由 </w:t>
+      </w:r>
+      <w:r>
+        <w:rPr/>
+        <w:t xml:space="preserve">367ms </w:t>
+      </w:r>
+      <w:r>
+        <w:rPr/>
+        <w:t xml:space="preserve">降至 </w:t>
+      </w:r>
+      <w:r>
+        <w:rPr/>
+        <w:t>19~23ms</w:t>
+      </w:r>
+      <w:r>
+        <w:rPr/>
+        <w:t xml:space="preserve">（详见详细设计 </w:t>
+      </w:r>
+      <w:r>
+        <w:rPr/>
+        <w:t>15.8</w:t>
+      </w:r>
+      <w:r>
+        <w:rPr/>
+        <w:t>），故从遗留项移除。</w:t>
+      </w:r>
+    </w:p>
     <w:p>
       <w:pPr>
         <w:pStyle w:val="Style13"/>
@@ -8459,11 +8609,11 @@
       </w:r>
       <w:r>
         <w:rPr/>
-        <w:t>F1.3 / F1.4</w:t>
-      </w:r>
-      <w:r>
-        <w:rPr/>
-        <w:t xml:space="preserve">（服务端令牌黑名单、个人资料与改密）。 </w:t>
+        <w:t xml:space="preserve">F1.3 / F1.4 </w:t>
+      </w:r>
+      <w:r>
+        <w:rPr/>
+        <w:t xml:space="preserve">的剩余部分（服务端令牌黑名单、修改密码；资料与头像已完成）。 </w:t>
       </w:r>
     </w:p>
     <w:p>
@@ -8485,15 +8635,15 @@
       </w:pPr>
       <w:r>
         <w:rPr/>
-        <w:t>推荐结果缓存：</w:t>
-      </w:r>
-      <w:r>
-        <w:rPr/>
-        <w:t xml:space="preserve">`recommend.enable-cache` </w:t>
-      </w:r>
-      <w:r>
-        <w:rPr/>
-        <w:t xml:space="preserve">已预留开关，补命中率指标与主动失效。 </w:t>
+        <w:t xml:space="preserve">推荐缓存已落地矩阵与邻居两层；尚缺命中率指标与主动失效策略（现为 </w:t>
+      </w:r>
+      <w:r>
+        <w:rPr/>
+        <w:t xml:space="preserve">TTL + </w:t>
+      </w:r>
+      <w:r>
+        <w:rPr/>
+        <w:t xml:space="preserve">手动刷新接口）。 </w:t>
       </w:r>
     </w:p>
     <w:p>

</xml_diff>